<commit_message>
Claudinho: revisão da Parte 4
Co-Authored-By: Claude Opus 5.5 <noreply@anthropic.com>
Claude-Session: https://claude.ai/code/session_01MJjUEEZrxQDEUifKK2vj9g
</commit_message>
<xml_diff>
--- a/roteiros/claudinho/Claudinho_Parte4.docx
+++ b/roteiros/claudinho/Claudinho_Parte4.docx
@@ -39,7 +39,7 @@
         <w:rPr>
           <w:color w:val="000000"/>
         </w:rPr>
-        <w:t>Desde cedo, as pessoas começaram a chegar.</w:t>
+        <w:t>As pessoas começaram a chegar.</w:t>
       </w:r>
     </w:p>
     <w:p>
@@ -175,7 +175,7 @@
         <w:rPr>
           <w:color w:val="000000"/>
         </w:rPr>
-        <w:t>Um homem que tinha sobrevivido a um acidente horas antes. Que tinha dividido o carro com Claudinho até o último segundo. E que agora ouvia, no velório do próprio chefe, parte da multidão acusando-o de ter matado o cantor.</w:t>
+        <w:t>Um homem que tinha sobrevivido a um acidente no dia anterior. Que tinha dividido o carro com Claudinho até o último segundo. E que agora ouvia, no velório do homem para quem trabalhava, parte da multidão acusando-o de ter matado o cantor.</w:t>
       </w:r>
     </w:p>
     <w:p>
@@ -239,7 +239,7 @@
         <w:rPr>
           <w:color w:val="C00000"/>
         </w:rPr>
-        <w:t>Guarde a palavra que foi gritada naquele velório. Porque, anos depois, um juiz ia analisar cada detalhe daquela madrugada. E a conclusão dele surpreendeu muita gente que estava ali, gritando.</w:t>
+        <w:t>Guarde a palavra que foi gritada naquele velório. Porque, anos depois, um juiz ia analisar cada detalhe daquela madrugada. E a conclusão dele ia apontar para outro lugar.</w:t>
       </w:r>
     </w:p>
     <w:p>
@@ -327,7 +327,7 @@
         <w:rPr>
           <w:color w:val="000000"/>
         </w:rPr>
-        <w:t>Buchecha tinha conseguido se reerguer. Anos depois, já com mais de quarenta, ainda voltou a estudar e se formou em marketing digital, em dois mil e vinte e quatro, sem largar a agenda de shows.</w:t>
+        <w:t>Buchecha tinha conseguido se reerguer. Anos depois, ainda voltou a estudar e se formou em marketing digital, em dois mil e vinte e quatro, sem largar a agenda de shows.</w:t>
       </w:r>
     </w:p>
     <w:p>
@@ -551,7 +551,7 @@
         <w:rPr>
           <w:color w:val="000000"/>
         </w:rPr>
-        <w:t>A música sobre o morro onde os dois amigos se reencontraram. A música que tirou Claudinho da obra. Segundo a viúva, o dinheiro dela não chega direito a quem ele deixou.</w:t>
+        <w:t>O Rap do Salgueiro. A música sobre o morro onde os dois amigos se reencontraram. A música que tirou Claudinho da obra. Segundo a viúva, o dinheiro dela não chega direito a quem ele deixou.</w:t>
       </w:r>
     </w:p>
     <w:p>
@@ -615,7 +615,7 @@
         <w:rPr>
           <w:color w:val="000000"/>
         </w:rPr>
-        <w:t>Segundo os irmãos de Buchecha, a mãe dele acabou fora de casa depois que o filho morreu.</w:t>
+        <w:t>Segundo os irmãos de Buchecha, a mãe de Claudinho acabou fora de casa depois que o filho morreu.</w:t>
       </w:r>
     </w:p>
     <w:p>

</xml_diff>